<commit_message>
Enrich decision dossier and editorial workshop with guided workflows
</commit_message>
<xml_diff>
--- a/assets/dossier-decisions/dossier-decisions.docx
+++ b/assets/dossier-decisions/dossier-decisions.docx
@@ -12,7 +12,7 @@
     </w:p>
     <w:p>
       <w:r>
-        <w:t>Farès Benamar · Exercice de conception · Version 1.0</w:t>
+        <w:t>Farès Benamar · Exercice de conception · Version 2.0</w:t>
       </w:r>
     </w:p>
     <w:p>
@@ -40,7 +40,7 @@
     </w:p>
     <w:p>
       <w:r>
-        <w:t>Auteur : Farès Benamar · Version 1.0</w:t>
+        <w:t>Auteur : Farès Benamar · Version 2.0</w:t>
       </w:r>
     </w:p>
     <w:p>
@@ -105,6 +105,38 @@
     <w:p>
       <w:r>
         <w:t>L’utilité, les conditions d’accès et la limite du service doivent être comprises avant de chercher à attirer davantage de visiteurs. Donner une marche à suivre courte et une possibilité de contact humain.</w:t>
+      </w:r>
+    </w:p>
+    <w:p>
+      <w:pPr>
+        <w:pStyle w:val="Heading2"/>
+      </w:pPr>
+      <w:r>
+        <w:t>Les options évaluées</w:t>
+      </w:r>
+    </w:p>
+    <w:p>
+      <w:pPr>
+        <w:pStyle w:val="ListBullet"/>
+      </w:pPr>
+      <w:r>
+        <w:t>Lancer une campagne large. Intérêt : Rendre le service rapidement visible. Risque : Générer des demandes avant que l’accueil soit prêt. Condition : À envisager après validation du service et des modalités.</w:t>
+      </w:r>
+    </w:p>
+    <w:p>
+      <w:pPr>
+        <w:pStyle w:val="ListBullet"/>
+      </w:pPr>
+      <w:r>
+        <w:t>Annoncer avec une marche à suivre — option retenue. Intérêt : Relier l’utilité du service à une action réalisable. Risque : Laisser une ambiguïté si les limites ne sont pas écrites. Condition : Périmètre et planning confirmés ; réponse d’accueil prête.</w:t>
+      </w:r>
+    </w:p>
+    <w:p>
+      <w:pPr>
+        <w:pStyle w:val="ListBullet"/>
+      </w:pPr>
+      <w:r>
+        <w:t>Préparer sans annoncer l’ouverture. Intérêt : Éviter de transformer une hypothèse en promesse. Risque : Laisser une demande sans réponse si l’on garde le silence. Condition : Répondre aux demandes reçues et demander la validation manquante.</w:t>
       </w:r>
     </w:p>
     <w:p>
@@ -206,7 +238,7 @@
         <w:pStyle w:val="ListBullet"/>
       </w:pPr>
       <w:r>
-        <w:t>0–30 min · Vérifier : Valider une fiche de référence : utilité, gratuité, modalités, limites et contact.</w:t>
+        <w:t>0–30 min · Vérifier : Valider une fiche de référence : utilité, gratuité, modalités, limites et contact. Responsable : Responsable de service. Livrable attendu : Une fiche de référence validée.</w:t>
       </w:r>
     </w:p>
     <w:p>
@@ -214,7 +246,7 @@
         <w:pStyle w:val="ListBullet"/>
       </w:pPr>
       <w:r>
-        <w:t>30–60 min · Aligner : Donner à l’accueil la réponse commune et les questions à faire remonter. Préparer l’accueil avant toute diffusion aux usagers.</w:t>
+        <w:t>30–60 min · Aligner : Donner à l’accueil la réponse commune et les questions à faire remonter. Préparer l’accueil avant toute diffusion aux usagers. Responsable : Responsable de l’accueil. Livrable attendu : Une réponse d’accueil commune.</w:t>
       </w:r>
     </w:p>
     <w:p>
@@ -222,7 +254,7 @@
         <w:pStyle w:val="ListBullet"/>
       </w:pPr>
       <w:r>
-        <w:t>60–120 min · Diffuser : Diffuser le support choisi puis vérifier que le point de contact répond correctement.</w:t>
+        <w:t>60–120 min · Diffuser : Diffuser le support choisi puis vérifier que le point de contact répond correctement. Responsable : Communication. Livrable attendu : Le support et le point de contact opérationnels.</w:t>
       </w:r>
     </w:p>
     <w:p>
@@ -230,7 +262,7 @@
         <w:pStyle w:val="ListBullet"/>
       </w:pPr>
       <w:r>
-        <w:t>À J+1 · Relire : Recueillir les questions récurrentes et corriger la fiche avant la vague suivante.</w:t>
+        <w:t>À J+1 · Relire : Recueillir les questions récurrentes et corriger la fiche avant la vague suivante. Responsable : Accueil et communication. Livrable attendu : Une liste des confusions à corriger.</w:t>
       </w:r>
     </w:p>
     <w:p>
@@ -388,7 +420,7 @@
     </w:p>
     <w:p>
       <w:r>
-        <w:t>Auteur : Farès Benamar · Version 1.0</w:t>
+        <w:t>Auteur : Farès Benamar · Version 2.0</w:t>
       </w:r>
     </w:p>
     <w:p>
@@ -453,6 +485,38 @@
     <w:p>
       <w:r>
         <w:t>Une difficulté d’accès n’est pas un simple problème de perception. Le message doit laisser une place à ce qui pourrait modifier la décision. Donner une marche à suivre courte et une possibilité de contact humain.</w:t>
+      </w:r>
+    </w:p>
+    <w:p>
+      <w:pPr>
+        <w:pStyle w:val="Heading2"/>
+      </w:pPr>
+      <w:r>
+        <w:t>Les options évaluées</w:t>
+      </w:r>
+    </w:p>
+    <w:p>
+      <w:pPr>
+        <w:pStyle w:val="ListBullet"/>
+      </w:pPr>
+      <w:r>
+        <w:t>Défendre immédiatement la réduction. Intérêt : Présenter les arguments de la direction. Risque : Faire croire qu’une consultation est déjà tranchée. Condition : Ne convient pas au statut non décidé de ce cas.</w:t>
+      </w:r>
+    </w:p>
+    <w:p>
+      <w:pPr>
+        <w:pStyle w:val="ListBullet"/>
+      </w:pPr>
+      <w:r>
+        <w:t>Expliquer et recueillir les contraintes — option retenue. Intérêt : Clarifier ce qui reste ouvert et faire remonter les usages. Risque : Créer une fausse attente si le circuit de traitement des avis n’existe pas. Condition : La direction confirme le recueil effectif et sa prise en compte dans l’arbitrage.</w:t>
+      </w:r>
+    </w:p>
+    <w:p>
+      <w:pPr>
+        <w:pStyle w:val="ListBullet"/>
+      </w:pPr>
+      <w:r>
+        <w:t>Attendre une justification complète. Intérêt : Éviter d’avancer des motifs non validés. Risque : Laisser croire que les horaires ont déjà changé. Condition : Même en attente, rappeler le statut de proposition et les horaires actuels.</w:t>
       </w:r>
     </w:p>
     <w:p>
@@ -554,7 +618,7 @@
         <w:pStyle w:val="ListBullet"/>
       </w:pPr>
       <w:r>
-        <w:t>0–30 min · Vérifier : Établir une référence distinguant proposition, horaires en vigueur et points ouverts.</w:t>
+        <w:t>0–30 min · Vérifier : Établir une référence distinguant proposition, horaires en vigueur et points ouverts. Responsable : Direction du site. Livrable attendu : Une note séparant proposition et décision.</w:t>
       </w:r>
     </w:p>
     <w:p>
@@ -562,7 +626,7 @@
         <w:pStyle w:val="ListBullet"/>
       </w:pPr>
       <w:r>
-        <w:t>30–60 min · Aligner : Briefer l’accueil sur les objections et sur la manière de consigner une contribution. Préparer l’accueil avant toute diffusion aux usagers.</w:t>
+        <w:t>30–60 min · Aligner : Briefer l’accueil sur les objections et sur la manière de consigner une contribution. Préparer l’accueil avant toute diffusion aux usagers. Responsable : Responsable de la consultation. Livrable attendu : Un circuit pour consigner les contributions.</w:t>
       </w:r>
     </w:p>
     <w:p>
@@ -570,7 +634,7 @@
         <w:pStyle w:val="ListBullet"/>
       </w:pPr>
       <w:r>
-        <w:t>60–120 min · Diffuser : Expliquer la proposition avec le canal choisi ; ouvrir le recueil des contraintes sans promettre une décision collective.</w:t>
+        <w:t>60–120 min · Diffuser : Expliquer la proposition avec le canal choisi ; ouvrir le recueil des contraintes sans promettre une décision collective. Responsable : Communication et accueil. Livrable attendu : Une explication et une voie de contribution.</w:t>
       </w:r>
     </w:p>
     <w:p>
@@ -578,7 +642,7 @@
         <w:pStyle w:val="ListBullet"/>
       </w:pPr>
       <w:r>
-        <w:t>À J+1 · Relire : Prévoir une restitution des thèmes recueillis et une explication de l’arbitrage une fois celui-ci rendu.</w:t>
+        <w:t>À J+1 · Relire : Prévoir une restitution des thèmes recueillis et une explication de l’arbitrage une fois celui-ci rendu. Responsable : Direction du site. Livrable attendu : Une synthèse et une réponse aux thèmes soulevés.</w:t>
       </w:r>
     </w:p>
     <w:p>
@@ -736,7 +800,7 @@
     </w:p>
     <w:p>
       <w:r>
-        <w:t>Auteur : Farès Benamar · Version 1.0</w:t>
+        <w:t>Auteur : Farès Benamar · Version 2.0</w:t>
       </w:r>
     </w:p>
     <w:p>
@@ -801,6 +865,38 @@
     <w:p>
       <w:r>
         <w:t>Une correction utile commence par le fait établi et sa référence. Une nouvelle campagne générale pourrait exposer à la rumeur des personnes qui ne l’avaient jamais vue. Donner une marche à suivre courte et une possibilité de contact humain.</w:t>
+      </w:r>
+    </w:p>
+    <w:p>
+      <w:pPr>
+        <w:pStyle w:val="Heading2"/>
+      </w:pPr>
+      <w:r>
+        <w:t>Les options évaluées</w:t>
+      </w:r>
+    </w:p>
+    <w:p>
+      <w:pPr>
+        <w:pStyle w:val="ListBullet"/>
+      </w:pPr>
+      <w:r>
+        <w:t>Démentir partout. Intérêt : Donner rapidement une réponse très visible. Risque : Faire découvrir la rumeur à des publics qui ne l’avaient pas vue. Condition : Une diffusion plus large se justifie par une circulation plus large constatée.</w:t>
+      </w:r>
+    </w:p>
+    <w:p>
+      <w:pPr>
+        <w:pStyle w:val="ListBullet"/>
+      </w:pPr>
+      <w:r>
+        <w:t>Corriger dans l’espace concerné — option retenue. Intérêt : Atteindre les personnes exposées avec un fait vérifiable. Risque : Laisser un autre espace sans réponse si la veille est incomplète. Condition : Barème confirmé et périmètre observé de la circulation vérifié.</w:t>
+      </w:r>
+    </w:p>
+    <w:p>
+      <w:pPr>
+        <w:pStyle w:val="ListBullet"/>
+      </w:pPr>
+      <w:r>
+        <w:t>Accuser réception puis vérifier. Intérêt : Reconnaître la demande sans improviser un démenti. Risque : Entretenir le doute si l’on ne revient pas avec la réponse. Condition : Donner une suite dans le même espace après confirmation du barème.</w:t>
       </w:r>
     </w:p>
     <w:p>
@@ -902,7 +998,7 @@
         <w:pStyle w:val="ListBullet"/>
       </w:pPr>
       <w:r>
-        <w:t>0–30 min · Vérifier : Vérifier le barème et le message initial ; définir le périmètre réellement observé.</w:t>
+        <w:t>0–30 min · Vérifier : Vérifier le barème et le message initial ; définir le périmètre réellement observé. Responsable : Responsable de service. Livrable attendu : Un barème confirmé et un périmètre observé.</w:t>
       </w:r>
     </w:p>
     <w:p>
@@ -910,7 +1006,7 @@
         <w:pStyle w:val="ListBullet"/>
       </w:pPr>
       <w:r>
-        <w:t>30–60 min · Aligner : Aligner l’accueil et préparer une réponse factuelle avec la référence consultable. Préparer l’accueil avant toute diffusion aux usagers.</w:t>
+        <w:t>30–60 min · Aligner : Aligner l’accueil et préparer une réponse factuelle avec la référence consultable. Préparer l’accueil avant toute diffusion aux usagers. Responsable : Communication et accueil. Livrable attendu : Une réponse de référence cohérente.</w:t>
       </w:r>
     </w:p>
     <w:p>
@@ -918,7 +1014,7 @@
         <w:pStyle w:val="ListBullet"/>
       </w:pPr>
       <w:r>
-        <w:t>60–120 min · Diffuser : Répondre dans l’espace concerné, sans relancer une diffusion générale non justifiée.</w:t>
+        <w:t>60–120 min · Diffuser : Répondre dans l’espace concerné, sans relancer une diffusion générale non justifiée. Responsable : Communication. Livrable attendu : Une correction visible dans l’espace concerné.</w:t>
       </w:r>
     </w:p>
     <w:p>
@@ -926,7 +1022,7 @@
         <w:pStyle w:val="ListBullet"/>
       </w:pPr>
       <w:r>
-        <w:t>À J+1 · Relire : Vérifier que la réponse est visible ; mettre à jour la même référence et garder la trace des corrections.</w:t>
+        <w:t>À J+1 · Relire : Vérifier que la réponse est visible ; mettre à jour la même référence et garder la trace des corrections. Responsable : Communication. Livrable attendu : Une trace des corrections et des questions restantes.</w:t>
       </w:r>
     </w:p>
     <w:p>

</xml_diff>